<commit_message>
Review 2 report and speaker notes: state that the experiments run on the PLY-based lexer and the DFA engine is checked against it
Co-Authored-By: Claude Sonnet 5.5 <noreply@anthropic.com>
Claude-Session: https://claude.ai/code/session_01Q1RoAMr7AGRCD4cuNgQnXj
</commit_message>
<xml_diff>
--- a/report/LexFront_Review2_Report.docx
+++ b/report/LexFront_Review2_Report.docx
@@ -29,7 +29,7 @@
           <w:sz w:val="30"/>
           <w:szCs w:val="30"/>
         </w:rPr>
-        <w:t xml:space="preserve">A DFA-Based Lexer Used as a Pre-Tokenizer for Noisy English Text Classification</w:t>
+        <w:t xml:space="preserve">A Compiler-Style Lexer Used as a Pre-Tokenizer for Noisy English Text Classification</w:t>
       </w:r>
     </w:p>
     <w:p>
@@ -75,7 +75,7 @@
           <w:sz w:val="24"/>
           <w:szCs w:val="24"/>
         </w:rPr>
-        <w:t xml:space="preserve">Text from social media is full of hashtags, mentions, links, emoticons and stretched-out words, and the tokenizers that most classifiers rely on were not designed with this in mind. In this project we ask whether a lexical analyzer built the way a compiler builds one can do a better job. We built LexFront, a lexer with eleven token classes, longest-match scanning, error recovery, a symbol table and six switchable normalization rules. We also wrote our own engine that turns regular expressions into an NFA, then a DFA, then a minimized DFA, and it runs four of the token classes. LexFront was compared against whitespace splitting, NLTK and TweetTokenizer, and against BPE, WordPiece and Unigram subword tokenizers, with the classifier kept the same each time. The tests used three datasets (tweet_topic, go_emotions and ag_news) with Naive Bayes and Logistic Regression.</w:t>
+        <w:t xml:space="preserve">Text from social media is full of hashtags, mentions, links, emoticons and stretched-out words, and the tokenizers that most classifiers rely on were not designed with this in mind. In this project we ask whether a lexical analyzer built the way a compiler builds one can do a better job. We built LexFront, a lexer with eleven token classes, longest-match scanning, error recovery, a symbol table and six switchable normalization rules. We also wrote our own engine that turns regular expressions into an NFA, then a DFA, then a minimized DFA. The experiments run on a PLY-based lexer, and our engine is checked against it, because it reproduces the same tokens on four of the token classes. LexFront was compared against whitespace splitting, NLTK and TweetTokenizer, and against BPE, WordPiece and Unigram subword tokenizers, with the classifier kept the same each time. The tests used three datasets (tweet_topic, go_emotions and ag_news) with Naive Bayes and Logistic Regression.</w:t>
       </w:r>
     </w:p>
     <w:p>
@@ -247,7 +247,7 @@
           <w:sz w:val="24"/>
           <w:szCs w:val="24"/>
         </w:rPr>
-        <w:t xml:space="preserve">On the practical side, Lex [8] generated scanners from regular expressions and was designed to work together with the parser generator Yacc [9]. PLY [10] brings the same style to Python, and we used it for our reference lexer. All of these tools take a list of patterns in priority order and apply longest match, with ties going to the earlier rule, which is the behaviour we copied. What we take from this area is the whole design vocabulary of LexFront: token classes, longest match, priority, semantic actions on tokens and panic-mode error recovery.</w:t>
+        <w:t xml:space="preserve">On the practical side, Lex [8] generated scanners from regular expressions and was designed to work together with the parser generator Yacc [9]. PLY [10] brings the same style to Python, and the tokenizer used in our experiments is built on it. All of these tools take a list of patterns in priority order and apply longest match, with ties going to the earlier rule, which is the behaviour we copied. What we take from this area is the whole design vocabulary of LexFront: token classes, longest match, priority, semantic actions on tokens and panic-mode error recovery.</w:t>
       </w:r>
     </w:p>
     <w:p>
@@ -904,7 +904,7 @@
           <w:sz w:val="24"/>
           <w:szCs w:val="24"/>
         </w:rPr>
-        <w:t xml:space="preserve">. A recursive-descent parser turns each regular expression into an AST, Thompson construction [5] gives an NFA, subset construction [6] gives a DFA over an alphabet that is split into atoms, and Moore's partition refinement [7] minimizes it. The engine runs four classes (EMOTICON, HASHTAG, MENTION and WORD), and a test checks that it produces the same tokens as the PLY lexer on those classes. ELONGATED is not part of the engine because its usual regex, (.)\1{2,}, needs a back-reference, which regular expressions cannot express.</w:t>
+        <w:t xml:space="preserve">. A recursive-descent parser turns each regular expression into an AST, Thompson construction [5] gives an NFA, subset construction [6] gives a DFA over an alphabet that is split into atoms, and Moore's partition refinement [7] minimizes it. The engine covers four classes (EMOTICON, HASHTAG, MENTION and WORD). The tokenizer used in the experiments is the PLY-based one, and our engine is a separate implementation that a test checks against it: it produces the same tokens on those four classes. ELONGATED is not part of the engine because its usual regex, (.)\1{2,}, needs a back-reference, which regular expressions cannot express.</w:t>
       </w:r>
     </w:p>
     <w:p>
@@ -12845,7 +12845,7 @@
           <w:sz w:val="24"/>
           <w:szCs w:val="24"/>
         </w:rPr>
-        <w:t xml:space="preserve">On the intrinsic side, LexFront has the best OOV rate and vocabulary size among the word-level tokenizers, with fertility close to the others. Throughput is in the same range as NLTK's, from about 0.84 times NLTK's speed on ag_news to 1.48 times on go_emotions on our machine, so the DFA-style scanner is not a bottleneck. On the subword side (Figure 5 and Table 8) no learned tokenizer is clearly better than NLTK in accuracy. Taken together, the dataset and classifier matter much more than the choice of tokenizer in this setting.</w:t>
+        <w:t xml:space="preserve">On the intrinsic side, LexFront has the best OOV rate and vocabulary size among the word-level tokenizers, with fertility close to the others. Throughput is in the same range as NLTK's, from about 0.84 times NLTK's speed on ag_news to 1.48 times on go_emotions on our machine, so the lexer is not a bottleneck. On the subword side (Figure 5 and Table 8) no learned tokenizer is clearly better than NLTK in accuracy. Taken together, the dataset and classifier matter much more than the choice of tokenizer in this setting.</w:t>
       </w:r>
     </w:p>
     <w:p>
@@ -12905,7 +12905,7 @@
           <w:sz w:val="24"/>
           <w:szCs w:val="24"/>
         </w:rPr>
-        <w:t xml:space="preserve">We built LexFront, a compiler-style lexer for noisy English text, with our own regex-to-DFA engine, a normalizer with six switchable rules, a symbol table and error recovery, and compared it with existing and subword tokenizers under a fixed classifier. The engine works as intended: the combined automaton goes from 43 NFA states to 12 DFA states and 10 minimized states, and it agrees with the PLY lexer on the four classes it covers.</w:t>
+        <w:t xml:space="preserve">We built LexFront, a compiler-style lexer for noisy English text, with our own regex-to-DFA engine, a normalizer with six switchable rules, a symbol table and error recovery, and compared it with existing and subword tokenizers under a fixed classifier. The engine works as intended: the combined automaton goes from 43 NFA states to 12 DFA states and 10 minimized states, and it agrees with the PLY lexer on the four classes it covers. The classification experiments themselves run on the PLY-based lexer.</w:t>
       </w:r>
     </w:p>
     <w:p>

</xml_diff>